<commit_message>
fix resources Crash Bug
</commit_message>
<xml_diff>
--- a/docs/official/policies/Afrivate-Performance-Appraisal-Form.docx
+++ b/docs/official/policies/Afrivate-Performance-Appraisal-Form.docx
@@ -2,22 +2,165 @@
 <file path=word/document.xml><?xml version="1.0" encoding="utf-8"?>
 <w:document xmlns:wpc="http://schemas.microsoft.com/office/word/2010/wordprocessingCanvas" xmlns:mc="http://schemas.openxmlformats.org/markup-compatibility/2006" xmlns:o="urn:schemas-microsoft-com:office:office" xmlns:r="http://schemas.openxmlformats.org/officeDocument/2006/relationships" xmlns:m="http://schemas.openxmlformats.org/officeDocument/2006/math" xmlns:v="urn:schemas-microsoft-com:vml" xmlns:wp14="http://schemas.microsoft.com/office/word/2010/wordprocessingDrawing" xmlns:wp="http://schemas.openxmlformats.org/drawingml/2006/wordprocessingDrawing" xmlns:w10="urn:schemas-microsoft-com:office:word" xmlns:w="http://schemas.openxmlformats.org/wordprocessingml/2006/main" xmlns:w14="http://schemas.microsoft.com/office/word/2010/wordml" xmlns:w15="http://schemas.microsoft.com/office/word/2012/wordml" xmlns:wpg="http://schemas.microsoft.com/office/word/2010/wordprocessingGroup" xmlns:wpi="http://schemas.microsoft.com/office/word/2010/wordprocessingInk" xmlns:wne="http://schemas.microsoft.com/office/word/2006/wordml" xmlns:wps="http://schemas.microsoft.com/office/word/2010/wordprocessingShape" xmlns:cx="http://schemas.microsoft.com/office/drawing/2014/chartex" xmlns:cx1="http://schemas.microsoft.com/office/drawing/2015/9/8/chartex" xmlns:cx2="http://schemas.microsoft.com/office/drawing/2015/10/21/chartex" xmlns:cx3="http://schemas.microsoft.com/office/drawing/2016/5/9/chartex" xmlns:cx4="http://schemas.microsoft.com/office/drawing/2016/5/10/chartex" xmlns:cx5="http://schemas.microsoft.com/office/drawing/2016/5/11/chartex" xmlns:cx6="http://schemas.microsoft.com/office/drawing/2016/5/12/chartex" xmlns:cx7="http://schemas.microsoft.com/office/drawing/2016/5/13/chartex" xmlns:cx8="http://schemas.microsoft.com/office/drawing/2016/5/14/chartex" xmlns:aink="http://schemas.microsoft.com/office/drawing/2016/ink" xmlns:am3d="http://schemas.microsoft.com/office/drawing/2017/model3d" xmlns:w16cex="http://schemas.microsoft.com/office/word/2018/wordml/cex" xmlns:w16cid="http://schemas.microsoft.com/office/word/2016/wordml/cid" xmlns:w16="http://schemas.microsoft.com/office/word/2018/wordml" xmlns:w16sdtdh="http://schemas.microsoft.com/office/word/2020/wordml/sdtdatahash" xmlns:w16se="http://schemas.microsoft.com/office/word/2015/wordml/symex" mc:Ignorable="w14 w15 wp14">
   <w:body>
+    <w:tbl>
+      <w:tblPr>
+        <w:tblW w:type="dxa" w:w="10080"/>
+        <w:tblBorders>
+          <w:top w:val="single" w:color="auto" w:sz="4"/>
+          <w:left w:val="single" w:color="auto" w:sz="4"/>
+          <w:bottom w:val="single" w:color="auto" w:sz="4"/>
+          <w:right w:val="single" w:color="auto" w:sz="4"/>
+          <w:insideH w:val="single" w:color="auto" w:sz="4"/>
+          <w:insideV w:val="single" w:color="auto" w:sz="4"/>
+        </w:tblBorders>
+      </w:tblPr>
+      <w:tblGrid>
+        <w:gridCol w:w="6300"/>
+        <w:gridCol w:w="3780"/>
+      </w:tblGrid>
+      <w:tr>
+        <w:tc>
+          <w:tcPr>
+            <w:tcW w:type="dxa" w:w="6300"/>
+            <w:tcBorders>
+              <w:top w:val="none" w:color="FFFFFF" w:sz="0"/>
+              <w:left w:val="none" w:color="FFFFFF" w:sz="0"/>
+              <w:bottom w:val="none" w:color="FFFFFF" w:sz="0"/>
+              <w:right w:val="none" w:color="FFFFFF" w:sz="0"/>
+            </w:tcBorders>
+            <w:vAlign w:val="center"/>
+          </w:tcPr>
+          <w:p>
+            <w:pPr>
+              <w:spacing w:after="0" w:before="0"/>
+            </w:pPr>
+            <w:r>
+              <w:drawing>
+                <wp:inline distT="0" distB="0" distL="0" distR="0">
+                  <wp:extent cx="1466850" cy="466725"/>
+                  <wp:effectExtent t="0" r="0" b="0" l="0"/>
+                  <wp:docPr id="1" name="" descr="" title=""/>
+                  <wp:cNvGraphicFramePr>
+                    <a:graphicFrameLocks xmlns:a="http://schemas.openxmlformats.org/drawingml/2006/main" noChangeAspect="1"/>
+                  </wp:cNvGraphicFramePr>
+                  <a:graphic xmlns:a="http://schemas.openxmlformats.org/drawingml/2006/main">
+                    <a:graphicData uri="http://schemas.openxmlformats.org/drawingml/2006/picture">
+                      <pic:pic xmlns:pic="http://schemas.openxmlformats.org/drawingml/2006/picture">
+                        <pic:nvPicPr>
+                          <pic:cNvPr id="0" name="" descr=""/>
+                          <pic:cNvPicPr>
+                            <a:picLocks noChangeAspect="1" noChangeArrowheads="1"/>
+                          </pic:cNvPicPr>
+                        </pic:nvPicPr>
+                        <pic:blipFill>
+                          <a:blip r:embed="rId8" cstate="none"/>
+                          <a:srcRect/>
+                          <a:stretch>
+                            <a:fillRect/>
+                          </a:stretch>
+                        </pic:blipFill>
+                        <pic:spPr bwMode="auto">
+                          <a:xfrm>
+                            <a:off x="0" y="0"/>
+                            <a:ext cx="1466850" cy="466725"/>
+                          </a:xfrm>
+                          <a:prstGeom prst="rect">
+                            <a:avLst/>
+                          </a:prstGeom>
+                        </pic:spPr>
+                      </pic:pic>
+                    </a:graphicData>
+                  </a:graphic>
+                </wp:inline>
+              </w:drawing>
+            </w:r>
+          </w:p>
+        </w:tc>
+        <w:tc>
+          <w:tcPr>
+            <w:tcW w:type="dxa" w:w="3780"/>
+            <w:tcBorders>
+              <w:top w:val="none" w:color="FFFFFF" w:sz="0"/>
+              <w:left w:val="none" w:color="FFFFFF" w:sz="0"/>
+              <w:bottom w:val="none" w:color="FFFFFF" w:sz="0"/>
+              <w:right w:val="none" w:color="FFFFFF" w:sz="0"/>
+            </w:tcBorders>
+            <w:vAlign w:val="center"/>
+          </w:tcPr>
+          <w:p>
+            <w:pPr>
+              <w:spacing w:after="0" w:before="0"/>
+              <w:jc w:val="right"/>
+            </w:pPr>
+            <w:r>
+              <w:rPr>
+                <w:rFonts w:ascii="Calibri" w:cs="Calibri" w:eastAsia="Calibri" w:hAnsi="Calibri"/>
+                <w:b w:val="false"/>
+                <w:bCs w:val="false"/>
+                <w:i w:val="false"/>
+                <w:iCs w:val="false"/>
+                <w:color w:val="5F5F5F"/>
+                <w:sz w:val="16"/>
+                <w:szCs w:val="16"/>
+              </w:rPr>
+              <w:t xml:space="preserve">Official Document</w:t>
+            </w:r>
+          </w:p>
+          <w:p>
+            <w:pPr>
+              <w:spacing w:after="0" w:before="0"/>
+              <w:jc w:val="right"/>
+            </w:pPr>
+            <w:r>
+              <w:rPr>
+                <w:rFonts w:ascii="Calibri" w:cs="Calibri" w:eastAsia="Calibri" w:hAnsi="Calibri"/>
+                <w:b w:val="false"/>
+                <w:bCs w:val="false"/>
+                <w:i w:val="false"/>
+                <w:iCs w:val="false"/>
+                <w:color w:val="5F5F5F"/>
+                <w:sz w:val="16"/>
+                <w:szCs w:val="16"/>
+              </w:rPr>
+              <w:t xml:space="preserve">AfriVate Technologies Ltd</w:t>
+            </w:r>
+          </w:p>
+          <w:p>
+            <w:pPr>
+              <w:spacing w:after="0" w:before="0"/>
+              <w:jc w:val="right"/>
+            </w:pPr>
+            <w:r>
+              <w:rPr>
+                <w:rFonts w:ascii="Calibri" w:cs="Calibri" w:eastAsia="Calibri" w:hAnsi="Calibri"/>
+                <w:b w:val="false"/>
+                <w:bCs w:val="false"/>
+                <w:i w:val="false"/>
+                <w:iCs w:val="false"/>
+                <w:color w:val="5F5F5F"/>
+                <w:sz w:val="16"/>
+                <w:szCs w:val="16"/>
+              </w:rPr>
+              <w:t xml:space="preserve">RC: 9210092</w:t>
+            </w:r>
+          </w:p>
+        </w:tc>
+      </w:tr>
+    </w:tbl>
     <w:p>
       <w:pPr>
-        <w:spacing w:after="40" w:before="0"/>
+        <w:pBdr>
+          <w:bottom w:val="single" w:color="8D4087" w:sz="18" w:space="4"/>
+        </w:pBdr>
+        <w:spacing w:after="160" w:before="60"/>
       </w:pPr>
       <w:r>
         <w:rPr>
           <w:rFonts w:ascii="Calibri" w:cs="Calibri" w:eastAsia="Calibri" w:hAnsi="Calibri"/>
-          <w:b w:val="false"/>
-          <w:bCs w:val="false"/>
-          <w:i w:val="false"/>
-          <w:iCs w:val="false"/>
-          <w:color w:val="5F5F5F"/>
-          <w:sz w:val="16"/>
-          <w:szCs w:val="16"/>
+          <w:sz w:val="4"/>
+          <w:szCs w:val="4"/>
         </w:rPr>
-        <w:t xml:space="preserve">AFRIVATE TECHNOLOGIES LTD · RC: 9210092</w:t>
+        <w:t xml:space="preserve"> </w:t>
       </w:r>
     </w:p>
     <w:p>
@@ -58,9 +201,416 @@
         <w:t xml:space="preserve">January – June 2026  ·  Mid-Year Review</w:t>
       </w:r>
     </w:p>
+    <w:tbl>
+      <w:tblPr>
+        <w:tblW w:type="dxa" w:w="10080"/>
+        <w:tblBorders>
+          <w:top w:val="single" w:color="auto" w:sz="4"/>
+          <w:left w:val="single" w:color="auto" w:sz="4"/>
+          <w:bottom w:val="single" w:color="auto" w:sz="4"/>
+          <w:right w:val="single" w:color="auto" w:sz="4"/>
+          <w:insideH w:val="single" w:color="auto" w:sz="4"/>
+          <w:insideV w:val="single" w:color="auto" w:sz="4"/>
+        </w:tblBorders>
+      </w:tblPr>
+      <w:tblGrid>
+        <w:gridCol w:w="2520"/>
+        <w:gridCol w:w="7560"/>
+      </w:tblGrid>
+      <w:tr>
+        <w:tc>
+          <w:tcPr>
+            <w:tcW w:type="dxa" w:w="2520"/>
+            <w:tcBorders>
+              <w:top w:val="single" w:color="EBDCEB" w:sz="6"/>
+              <w:left w:val="single" w:color="EBDCEB" w:sz="6"/>
+              <w:bottom w:val="single" w:color="EBDCEB" w:sz="6"/>
+              <w:right w:val="single" w:color="EBDCEB" w:sz="6"/>
+            </w:tcBorders>
+            <w:shd w:fill="F8F3F8" w:val="clear"/>
+            <w:vAlign w:val="center"/>
+          </w:tcPr>
+          <w:p>
+            <w:pPr>
+              <w:spacing w:after="40" w:before="40"/>
+              <w:jc w:val="left"/>
+            </w:pPr>
+            <w:r>
+              <w:rPr>
+                <w:rFonts w:ascii="Calibri" w:cs="Calibri" w:eastAsia="Calibri" w:hAnsi="Calibri"/>
+                <w:b/>
+                <w:bCs/>
+                <w:i w:val="false"/>
+                <w:iCs w:val="false"/>
+                <w:color w:val="8D4087"/>
+                <w:sz w:val="17"/>
+                <w:szCs w:val="17"/>
+              </w:rPr>
+              <w:t xml:space="preserve">Document Code</w:t>
+            </w:r>
+          </w:p>
+        </w:tc>
+        <w:tc>
+          <w:tcPr>
+            <w:tcW w:type="dxa" w:w="7560"/>
+            <w:tcBorders>
+              <w:top w:val="single" w:color="EBDCEB" w:sz="6"/>
+              <w:left w:val="single" w:color="EBDCEB" w:sz="6"/>
+              <w:bottom w:val="single" w:color="EBDCEB" w:sz="6"/>
+              <w:right w:val="single" w:color="EBDCEB" w:sz="6"/>
+            </w:tcBorders>
+            <w:vAlign w:val="center"/>
+          </w:tcPr>
+          <w:p>
+            <w:pPr>
+              <w:spacing w:after="40" w:before="40"/>
+              <w:jc w:val="left"/>
+            </w:pPr>
+            <w:r>
+              <w:rPr>
+                <w:rFonts w:ascii="Calibri" w:cs="Calibri" w:eastAsia="Calibri" w:hAnsi="Calibri"/>
+                <w:b w:val="false"/>
+                <w:bCs w:val="false"/>
+                <w:i w:val="false"/>
+                <w:iCs w:val="false"/>
+                <w:color w:val="5F5F5F"/>
+                <w:sz w:val="17"/>
+                <w:szCs w:val="17"/>
+              </w:rPr>
+              <w:t xml:space="preserve">AFRI-PAF-01</w:t>
+            </w:r>
+          </w:p>
+        </w:tc>
+      </w:tr>
+      <w:tr>
+        <w:tc>
+          <w:tcPr>
+            <w:tcW w:type="dxa" w:w="2520"/>
+            <w:tcBorders>
+              <w:top w:val="single" w:color="EBDCEB" w:sz="6"/>
+              <w:left w:val="single" w:color="EBDCEB" w:sz="6"/>
+              <w:bottom w:val="single" w:color="EBDCEB" w:sz="6"/>
+              <w:right w:val="single" w:color="EBDCEB" w:sz="6"/>
+            </w:tcBorders>
+            <w:shd w:fill="F8F3F8" w:val="clear"/>
+            <w:vAlign w:val="center"/>
+          </w:tcPr>
+          <w:p>
+            <w:pPr>
+              <w:spacing w:after="40" w:before="40"/>
+              <w:jc w:val="left"/>
+            </w:pPr>
+            <w:r>
+              <w:rPr>
+                <w:rFonts w:ascii="Calibri" w:cs="Calibri" w:eastAsia="Calibri" w:hAnsi="Calibri"/>
+                <w:b/>
+                <w:bCs/>
+                <w:i w:val="false"/>
+                <w:iCs w:val="false"/>
+                <w:color w:val="8D4087"/>
+                <w:sz w:val="17"/>
+                <w:szCs w:val="17"/>
+              </w:rPr>
+              <w:t xml:space="preserve">Status</w:t>
+            </w:r>
+          </w:p>
+        </w:tc>
+        <w:tc>
+          <w:tcPr>
+            <w:tcW w:type="dxa" w:w="7560"/>
+            <w:tcBorders>
+              <w:top w:val="single" w:color="EBDCEB" w:sz="6"/>
+              <w:left w:val="single" w:color="EBDCEB" w:sz="6"/>
+              <w:bottom w:val="single" w:color="EBDCEB" w:sz="6"/>
+              <w:right w:val="single" w:color="EBDCEB" w:sz="6"/>
+            </w:tcBorders>
+            <w:vAlign w:val="center"/>
+          </w:tcPr>
+          <w:p>
+            <w:pPr>
+              <w:spacing w:after="40" w:before="40"/>
+              <w:jc w:val="left"/>
+            </w:pPr>
+            <w:r>
+              <w:rPr>
+                <w:rFonts w:ascii="Calibri" w:cs="Calibri" w:eastAsia="Calibri" w:hAnsi="Calibri"/>
+                <w:b w:val="false"/>
+                <w:bCs w:val="false"/>
+                <w:i w:val="false"/>
+                <w:iCs w:val="false"/>
+                <w:color w:val="5F5F5F"/>
+                <w:sz w:val="17"/>
+                <w:szCs w:val="17"/>
+              </w:rPr>
+              <w:t xml:space="preserve">Official form — complete and record in the Portal</w:t>
+            </w:r>
+          </w:p>
+        </w:tc>
+      </w:tr>
+      <w:tr>
+        <w:tc>
+          <w:tcPr>
+            <w:tcW w:type="dxa" w:w="2520"/>
+            <w:tcBorders>
+              <w:top w:val="single" w:color="EBDCEB" w:sz="6"/>
+              <w:left w:val="single" w:color="EBDCEB" w:sz="6"/>
+              <w:bottom w:val="single" w:color="EBDCEB" w:sz="6"/>
+              <w:right w:val="single" w:color="EBDCEB" w:sz="6"/>
+            </w:tcBorders>
+            <w:shd w:fill="F8F3F8" w:val="clear"/>
+            <w:vAlign w:val="center"/>
+          </w:tcPr>
+          <w:p>
+            <w:pPr>
+              <w:spacing w:after="40" w:before="40"/>
+              <w:jc w:val="left"/>
+            </w:pPr>
+            <w:r>
+              <w:rPr>
+                <w:rFonts w:ascii="Calibri" w:cs="Calibri" w:eastAsia="Calibri" w:hAnsi="Calibri"/>
+                <w:b/>
+                <w:bCs/>
+                <w:i w:val="false"/>
+                <w:iCs w:val="false"/>
+                <w:color w:val="8D4087"/>
+                <w:sz w:val="17"/>
+                <w:szCs w:val="17"/>
+              </w:rPr>
+              <w:t xml:space="preserve">Applies To</w:t>
+            </w:r>
+          </w:p>
+        </w:tc>
+        <w:tc>
+          <w:tcPr>
+            <w:tcW w:type="dxa" w:w="7560"/>
+            <w:tcBorders>
+              <w:top w:val="single" w:color="EBDCEB" w:sz="6"/>
+              <w:left w:val="single" w:color="EBDCEB" w:sz="6"/>
+              <w:bottom w:val="single" w:color="EBDCEB" w:sz="6"/>
+              <w:right w:val="single" w:color="EBDCEB" w:sz="6"/>
+            </w:tcBorders>
+            <w:vAlign w:val="center"/>
+          </w:tcPr>
+          <w:p>
+            <w:pPr>
+              <w:spacing w:after="40" w:before="40"/>
+              <w:jc w:val="left"/>
+            </w:pPr>
+            <w:r>
+              <w:rPr>
+                <w:rFonts w:ascii="Calibri" w:cs="Calibri" w:eastAsia="Calibri" w:hAnsi="Calibri"/>
+                <w:b w:val="false"/>
+                <w:bCs w:val="false"/>
+                <w:i w:val="false"/>
+                <w:iCs w:val="false"/>
+                <w:color w:val="5F5F5F"/>
+                <w:sz w:val="17"/>
+                <w:szCs w:val="17"/>
+              </w:rPr>
+              <w:t xml:space="preserve">All AfriVate Team Members under review</w:t>
+            </w:r>
+          </w:p>
+        </w:tc>
+      </w:tr>
+      <w:tr>
+        <w:tc>
+          <w:tcPr>
+            <w:tcW w:type="dxa" w:w="2520"/>
+            <w:tcBorders>
+              <w:top w:val="single" w:color="EBDCEB" w:sz="6"/>
+              <w:left w:val="single" w:color="EBDCEB" w:sz="6"/>
+              <w:bottom w:val="single" w:color="EBDCEB" w:sz="6"/>
+              <w:right w:val="single" w:color="EBDCEB" w:sz="6"/>
+            </w:tcBorders>
+            <w:shd w:fill="F8F3F8" w:val="clear"/>
+            <w:vAlign w:val="center"/>
+          </w:tcPr>
+          <w:p>
+            <w:pPr>
+              <w:spacing w:after="40" w:before="40"/>
+              <w:jc w:val="left"/>
+            </w:pPr>
+            <w:r>
+              <w:rPr>
+                <w:rFonts w:ascii="Calibri" w:cs="Calibri" w:eastAsia="Calibri" w:hAnsi="Calibri"/>
+                <w:b/>
+                <w:bCs/>
+                <w:i w:val="false"/>
+                <w:iCs w:val="false"/>
+                <w:color w:val="8D4087"/>
+                <w:sz w:val="17"/>
+                <w:szCs w:val="17"/>
+              </w:rPr>
+              <w:t xml:space="preserve">Owner</w:t>
+            </w:r>
+          </w:p>
+        </w:tc>
+        <w:tc>
+          <w:tcPr>
+            <w:tcW w:type="dxa" w:w="7560"/>
+            <w:tcBorders>
+              <w:top w:val="single" w:color="EBDCEB" w:sz="6"/>
+              <w:left w:val="single" w:color="EBDCEB" w:sz="6"/>
+              <w:bottom w:val="single" w:color="EBDCEB" w:sz="6"/>
+              <w:right w:val="single" w:color="EBDCEB" w:sz="6"/>
+            </w:tcBorders>
+            <w:vAlign w:val="center"/>
+          </w:tcPr>
+          <w:p>
+            <w:pPr>
+              <w:spacing w:after="40" w:before="40"/>
+              <w:jc w:val="left"/>
+            </w:pPr>
+            <w:r>
+              <w:rPr>
+                <w:rFonts w:ascii="Calibri" w:cs="Calibri" w:eastAsia="Calibri" w:hAnsi="Calibri"/>
+                <w:b w:val="false"/>
+                <w:bCs w:val="false"/>
+                <w:i w:val="false"/>
+                <w:iCs w:val="false"/>
+                <w:color w:val="5F5F5F"/>
+                <w:sz w:val="17"/>
+                <w:szCs w:val="17"/>
+              </w:rPr>
+              <w:t xml:space="preserve">People &amp; Culture</w:t>
+            </w:r>
+          </w:p>
+        </w:tc>
+      </w:tr>
+      <w:tr>
+        <w:tc>
+          <w:tcPr>
+            <w:tcW w:type="dxa" w:w="2520"/>
+            <w:tcBorders>
+              <w:top w:val="single" w:color="EBDCEB" w:sz="6"/>
+              <w:left w:val="single" w:color="EBDCEB" w:sz="6"/>
+              <w:bottom w:val="single" w:color="EBDCEB" w:sz="6"/>
+              <w:right w:val="single" w:color="EBDCEB" w:sz="6"/>
+            </w:tcBorders>
+            <w:shd w:fill="F8F3F8" w:val="clear"/>
+            <w:vAlign w:val="center"/>
+          </w:tcPr>
+          <w:p>
+            <w:pPr>
+              <w:spacing w:after="40" w:before="40"/>
+              <w:jc w:val="left"/>
+            </w:pPr>
+            <w:r>
+              <w:rPr>
+                <w:rFonts w:ascii="Calibri" w:cs="Calibri" w:eastAsia="Calibri" w:hAnsi="Calibri"/>
+                <w:b/>
+                <w:bCs/>
+                <w:i w:val="false"/>
+                <w:iCs w:val="false"/>
+                <w:color w:val="8D4087"/>
+                <w:sz w:val="17"/>
+                <w:szCs w:val="17"/>
+              </w:rPr>
+              <w:t xml:space="preserve">Related</w:t>
+            </w:r>
+          </w:p>
+        </w:tc>
+        <w:tc>
+          <w:tcPr>
+            <w:tcW w:type="dxa" w:w="7560"/>
+            <w:tcBorders>
+              <w:top w:val="single" w:color="EBDCEB" w:sz="6"/>
+              <w:left w:val="single" w:color="EBDCEB" w:sz="6"/>
+              <w:bottom w:val="single" w:color="EBDCEB" w:sz="6"/>
+              <w:right w:val="single" w:color="EBDCEB" w:sz="6"/>
+            </w:tcBorders>
+            <w:vAlign w:val="center"/>
+          </w:tcPr>
+          <w:p>
+            <w:pPr>
+              <w:spacing w:after="40" w:before="40"/>
+              <w:jc w:val="left"/>
+            </w:pPr>
+            <w:r>
+              <w:rPr>
+                <w:rFonts w:ascii="Calibri" w:cs="Calibri" w:eastAsia="Calibri" w:hAnsi="Calibri"/>
+                <w:b w:val="false"/>
+                <w:bCs w:val="false"/>
+                <w:i w:val="false"/>
+                <w:iCs w:val="false"/>
+                <w:color w:val="5F5F5F"/>
+                <w:sz w:val="17"/>
+                <w:szCs w:val="17"/>
+              </w:rPr>
+              <w:t xml:space="preserve">AFRI-SWP · AFRI-ICEF-01 · AFRI-TLOP-01 · AFRI-ORG-01</w:t>
+            </w:r>
+          </w:p>
+        </w:tc>
+      </w:tr>
+      <w:tr>
+        <w:tc>
+          <w:tcPr>
+            <w:tcW w:type="dxa" w:w="2520"/>
+            <w:tcBorders>
+              <w:top w:val="single" w:color="EBDCEB" w:sz="6"/>
+              <w:left w:val="single" w:color="EBDCEB" w:sz="6"/>
+              <w:bottom w:val="single" w:color="EBDCEB" w:sz="6"/>
+              <w:right w:val="single" w:color="EBDCEB" w:sz="6"/>
+            </w:tcBorders>
+            <w:shd w:fill="F8F3F8" w:val="clear"/>
+            <w:vAlign w:val="center"/>
+          </w:tcPr>
+          <w:p>
+            <w:pPr>
+              <w:spacing w:after="40" w:before="40"/>
+              <w:jc w:val="left"/>
+            </w:pPr>
+            <w:r>
+              <w:rPr>
+                <w:rFonts w:ascii="Calibri" w:cs="Calibri" w:eastAsia="Calibri" w:hAnsi="Calibri"/>
+                <w:b/>
+                <w:bCs/>
+                <w:i w:val="false"/>
+                <w:iCs w:val="false"/>
+                <w:color w:val="8D4087"/>
+                <w:sz w:val="17"/>
+                <w:szCs w:val="17"/>
+              </w:rPr>
+              <w:t xml:space="preserve">Contact</w:t>
+            </w:r>
+          </w:p>
+        </w:tc>
+        <w:tc>
+          <w:tcPr>
+            <w:tcW w:type="dxa" w:w="7560"/>
+            <w:tcBorders>
+              <w:top w:val="single" w:color="EBDCEB" w:sz="6"/>
+              <w:left w:val="single" w:color="EBDCEB" w:sz="6"/>
+              <w:bottom w:val="single" w:color="EBDCEB" w:sz="6"/>
+              <w:right w:val="single" w:color="EBDCEB" w:sz="6"/>
+            </w:tcBorders>
+            <w:vAlign w:val="center"/>
+          </w:tcPr>
+          <w:p>
+            <w:pPr>
+              <w:spacing w:after="40" w:before="40"/>
+              <w:jc w:val="left"/>
+            </w:pPr>
+            <w:r>
+              <w:rPr>
+                <w:rFonts w:ascii="Calibri" w:cs="Calibri" w:eastAsia="Calibri" w:hAnsi="Calibri"/>
+                <w:b w:val="false"/>
+                <w:bCs w:val="false"/>
+                <w:i w:val="false"/>
+                <w:iCs w:val="false"/>
+                <w:color w:val="5F5F5F"/>
+                <w:sz w:val="17"/>
+                <w:szCs w:val="17"/>
+              </w:rPr>
+              <w:t xml:space="preserve">hr@afrivate.org</w:t>
+            </w:r>
+          </w:p>
+        </w:tc>
+      </w:tr>
+    </w:tbl>
     <w:p>
       <w:pPr>
-        <w:spacing w:after="160" w:before="0"/>
+        <w:spacing w:after="160" w:before="160"/>
       </w:pPr>
       <w:r>
         <w:rPr>
@@ -73,7 +623,7 @@
           <w:sz w:val="18"/>
           <w:szCs w:val="18"/>
         </w:rPr>
-        <w:t xml:space="preserve">This evaluation links role expectations to actual performance. Its purpose is professional development—identifying strengths and improvement areas—and to help management assess performance and plan career-development interventions.</w:t>
+        <w:t xml:space="preserve">This evaluation links role expectations to actual performance. Complete it in discussion with the Team Member. Record the outcome in the AfriVate Portal. Slack does not replace the Portal record. This form does not create employment or any right to pay.</w:t>
       </w:r>
     </w:p>
     <w:p>
@@ -91,7 +641,7 @@
           <w:sz w:val="22"/>
           <w:szCs w:val="22"/>
         </w:rPr>
-        <w:t xml:space="preserve">1. Employee details</w:t>
+        <w:t xml:space="preserve">1. Team Member details</w:t>
       </w:r>
     </w:p>
     <w:tbl>
@@ -141,7 +691,7 @@
                 <w:sz w:val="16"/>
                 <w:szCs w:val="16"/>
               </w:rPr>
-              <w:t xml:space="preserve">Employee name</w:t>
+              <w:t xml:space="preserve">Team Member name</w:t>
             </w:r>
           </w:p>
         </w:tc>
@@ -173,7 +723,7 @@
                 <w:sz w:val="16"/>
                 <w:szCs w:val="16"/>
               </w:rPr>
-              <w:t xml:space="preserve">Supervisor / manager</w:t>
+              <w:t xml:space="preserve">Supervisor / Team Lead</w:t>
             </w:r>
           </w:p>
         </w:tc>
@@ -205,7 +755,7 @@
                 <w:sz w:val="16"/>
                 <w:szCs w:val="16"/>
               </w:rPr>
-              <w:t xml:space="preserve">Job title / grade</w:t>
+              <w:t xml:space="preserve">Job title</w:t>
             </w:r>
           </w:p>
         </w:tc>
@@ -574,10 +1124,10 @@
                 <w:i/>
                 <w:iCs/>
                 <w:color w:val="5F5F5F"/>
-                <w:sz w:val="16"/>
-                <w:szCs w:val="16"/>
-              </w:rPr>
-              <w:t xml:space="preserve">Employee / Volunteer / Contractor</w:t>
+                <w:sz w:val="15"/>
+                <w:szCs w:val="15"/>
+              </w:rPr>
+              <w:t xml:space="preserve">Internal Contributor / Employee / Volunteer / Contractor</w:t>
             </w:r>
           </w:p>
         </w:tc>
@@ -1014,7 +1564,7 @@
                 <w:sz w:val="16"/>
                 <w:szCs w:val="16"/>
               </w:rPr>
-              <w:t xml:space="preserve">Performance requires a formal Performance Improvement Plan (typically three months). Strong improvement may support retention; escalate per SWP if not.</w:t>
+              <w:t xml:space="preserve">Performance requires a formal Performance Improvement Plan (typically three months). Strong improvement may support retention; escalate per AFRI-SWP if not.</w:t>
             </w:r>
           </w:p>
         </w:tc>
@@ -1204,7 +1754,7 @@
                 <w:sz w:val="16"/>
                 <w:szCs w:val="16"/>
               </w:rPr>
-              <w:t xml:space="preserve">Unacceptable performance. Subject to fair review and applicable policy; termination may be considered.</w:t>
+              <w:t xml:space="preserve">Unacceptable performance. Subject to fair review and applicable policy; end of engagement or termination may be considered.</w:t>
             </w:r>
           </w:p>
         </w:tc>
@@ -1518,7 +2068,7 @@
           <w:sz w:val="16"/>
           <w:szCs w:val="16"/>
         </w:rPr>
-        <w:t xml:space="preserve">Aligned with AfriVate SWP appraisal structure: 60% deliverables &amp; output · 40% professional / soft skills.</w:t>
+        <w:t xml:space="preserve">Aligned with AFRI-SWP: 60% deliverables and output · 40% professional / soft skills.</w:t>
       </w:r>
     </w:p>
     <w:p>
@@ -3948,7 +4498,7 @@
           <w:sz w:val="22"/>
           <w:szCs w:val="22"/>
         </w:rPr>
-        <w:t xml:space="preserve">7. Comments &amp; development</w:t>
+        <w:t xml:space="preserve">7. Comments and development</w:t>
       </w:r>
     </w:p>
     <w:p>
@@ -3966,7 +4516,7 @@
           <w:sz w:val="18"/>
           <w:szCs w:val="18"/>
         </w:rPr>
-        <w:t xml:space="preserve">Supervisor / line manager — comments &amp; recommendation</w:t>
+        <w:t xml:space="preserve">Supervisor / Team Lead — comments and recommendation</w:t>
       </w:r>
     </w:p>
     <w:tbl>
@@ -4065,7 +4615,7 @@
           <w:sz w:val="18"/>
           <w:szCs w:val="18"/>
         </w:rPr>
-        <w:t xml:space="preserve">Appraisee comment</w:t>
+        <w:t xml:space="preserve">Team Member comment</w:t>
       </w:r>
     </w:p>
     <w:tbl>
@@ -4151,7 +4701,7 @@
           <w:sz w:val="18"/>
           <w:szCs w:val="18"/>
         </w:rPr>
-        <w:t xml:space="preserve">Senior manager comment</w:t>
+        <w:t xml:space="preserve">Pillar Head / senior manager comment</w:t>
       </w:r>
     </w:p>
     <w:tbl>
@@ -4396,7 +4946,7 @@
           <w:sz w:val="18"/>
           <w:szCs w:val="18"/>
         </w:rPr>
-        <w:t xml:space="preserve">People &amp; Culture (HR) comment</w:t>
+        <w:t xml:space="preserve">People &amp; Culture comment</w:t>
       </w:r>
     </w:p>
     <w:tbl>
@@ -4548,7 +5098,7 @@
                 <w:sz w:val="18"/>
                 <w:szCs w:val="18"/>
               </w:rPr>
-              <w:t xml:space="preserve">Employee</w:t>
+              <w:t xml:space="preserve">Team Member</w:t>
             </w:r>
           </w:p>
         </w:tc>
@@ -4580,7 +5130,7 @@
                 <w:sz w:val="18"/>
                 <w:szCs w:val="18"/>
               </w:rPr>
-              <w:t xml:space="preserve">Manager / line supervisor / HOD</w:t>
+              <w:t xml:space="preserve">Manager / Team Lead / Pillar Head</w:t>
             </w:r>
           </w:p>
         </w:tc>
@@ -4750,7 +5300,7 @@
                 <w:sz w:val="17"/>
                 <w:szCs w:val="17"/>
               </w:rPr>
-              <w:t xml:space="preserve">HR use only</w:t>
+              <w:t xml:space="preserve">People &amp; Culture use only</w:t>
             </w:r>
           </w:p>
           <w:p>
@@ -4828,12 +5378,13 @@
           <w:sz w:val="15"/>
           <w:szCs w:val="15"/>
         </w:rPr>
-        <w:t xml:space="preserve">Document code: AFRI-PAF-01 · Pair with Portal appraisals &amp; SWP progressive discipline. Internal use.</w:t>
+        <w:t xml:space="preserve">Document code: AFRI-PAF-01 · Pair with Portal appraisals and AFRI-SWP progressive discipline. Internal use.</w:t>
       </w:r>
     </w:p>
     <w:sectPr>
+      <w:footerReference w:type="default" r:id="rId7"/>
       <w:pgSz w:w="11906" w:h="16838" w:orient="portrait"/>
-      <w:pgMar w:top="720" w:right="720" w:bottom="720" w:left="720" w:header="708" w:footer="708" w:gutter="0"/>
+      <w:pgMar w:top="720" w:right="720" w:bottom="900" w:left="720" w:header="708" w:footer="708" w:gutter="0"/>
       <w:pgNumType/>
       <w:docGrid w:linePitch="360"/>
     </w:sectPr>
@@ -4880,6 +5431,25 @@
     </w:p>
   </w:endnote>
 </w:endnotes>
+</file>
+
+<file path=word/footer1.xml><?xml version="1.0" encoding="utf-8"?>
+<w:ftr xmlns:wpc="http://schemas.microsoft.com/office/word/2010/wordprocessingCanvas" xmlns:mc="http://schemas.openxmlformats.org/markup-compatibility/2006" xmlns:o="urn:schemas-microsoft-com:office:office" xmlns:r="http://schemas.openxmlformats.org/officeDocument/2006/relationships" xmlns:m="http://schemas.openxmlformats.org/officeDocument/2006/math" xmlns:v="urn:schemas-microsoft-com:vml" xmlns:wp14="http://schemas.microsoft.com/office/word/2010/wordprocessingDrawing" xmlns:wp="http://schemas.openxmlformats.org/drawingml/2006/wordprocessingDrawing" xmlns:w10="urn:schemas-microsoft-com:office:word" xmlns:w="http://schemas.openxmlformats.org/wordprocessingml/2006/main" xmlns:w14="http://schemas.microsoft.com/office/word/2010/wordml" xmlns:w15="http://schemas.microsoft.com/office/word/2012/wordml" xmlns:wpg="http://schemas.microsoft.com/office/word/2010/wordprocessingGroup" xmlns:wpi="http://schemas.microsoft.com/office/word/2010/wordprocessingInk" xmlns:wne="http://schemas.microsoft.com/office/word/2006/wordml" xmlns:wps="http://schemas.microsoft.com/office/word/2010/wordprocessingShape">
+  <w:p>
+    <w:pPr>
+      <w:spacing w:after="0"/>
+    </w:pPr>
+    <w:r>
+      <w:rPr>
+        <w:rFonts w:ascii="Calibri" w:cs="Calibri" w:eastAsia="Calibri" w:hAnsi="Calibri"/>
+        <w:color w:val="5F5F5F"/>
+        <w:sz w:val="16"/>
+        <w:szCs w:val="16"/>
+      </w:rPr>
+      <w:t xml:space="preserve">hr@afrivate.org  ·  AFRI-PAF-01  ·  portal.afrivate.org          AfriVate Technologies Ltd  ·  RC: 9210092</w:t>
+    </w:r>
+  </w:p>
+</w:ftr>
 </file>
 
 <file path=word/footnotes.xml><?xml version="1.0" encoding="utf-8"?>

</xml_diff>